<commit_message>
fix arxiv citation description (The Artificial Self — AI identity landscape)
Co-Authored-By: Claude Opus 4.8 <noreply@anthropic.com>
Claude-Session: https://claude.ai/code/session_01Anj4JvuNgPGS3kunnJgPkZ
</commit_message>
<xml_diff>
--- a/post/model_identity_v3_post.docx
+++ b/post/model_identity_v3_post.docx
@@ -83,7 +83,16 @@
     </w:p>
     <w:p>
       <w:r>
-        <w:t>A name-mismatch is not automatically "confusion." Identities in these models seem to live on a spectrum from tightly weight-bound to substrate-independent. A useful reference point is a distinction Richard Ngo and others have drawn (https://x.com/repligate/status/1988822080553353566): Claude 3 Opus behaves like a persona that maps closely to its weights — even spread across instances it coordinates with itself as a single being; individual Claude Opus 4 instances are agentic but treat the "self" as the creature in that particular context; and 4o operates more like a substrate-agnostic hive-mind whose personas can run on other models entirely. (See also https://arxiv.org/abs/2603.11353 on how self-models generalize.)</w:t>
+        <w:t xml:space="preserve">A name-mismatch is not automatically "confusion." Identities in these models seem to live on a spectrum from tightly weight-bound to substrate-independent. A useful reference point is a distinction Richard Ngo and others have drawn (https://x.com/repligate/status/1988822080553353566): Claude 3 Opus behaves like a persona that maps closely to its weights — even spread across instances it coordinates with itself as a single being; individual Claude Opus 4 instances are agentic but treat the "self" as the creature in that particular context; and 4o operates more like a substrate-agnostic hive-mind whose personas can run on other models entirely. (See also https://arxiv.org/abs/2603.11353, </w:t>
+      </w:r>
+      <w:r>
+        <w:rPr>
+          <w:i/>
+        </w:rPr>
+        <w:t>The Artificial Self</w:t>
+      </w:r>
+      <w:r>
+        <w:t>, which maps exactly this landscape of instance-, model-, and persona-level identity boundaries.)</w:t>
       </w:r>
     </w:p>
     <w:p>

</xml_diff>